<commit_message>
Add GitHub link to Module 7 document
</commit_message>
<xml_diff>
--- a/module-7/Cortez-Module-7.2-Movies-Update-and-Deletes.docx
+++ b/module-7/Cortez-Module-7.2-Movies-Update-and-Deletes.docx
@@ -79,6 +79,9 @@
     <w:p/>
     <w:p>
       <w:r>
+        <w:rPr>
+          <w:noProof/>
+        </w:rPr>
         <w:drawing>
           <wp:inline distT="0" distB="0" distL="0" distR="0" wp14:anchorId="2770FD25" wp14:editId="57906299">
             <wp:extent cx="5943600" cy="3188970"/>
@@ -119,6 +122,9 @@
     <w:p/>
     <w:p>
       <w:r>
+        <w:rPr>
+          <w:noProof/>
+        </w:rPr>
         <w:lastRenderedPageBreak/>
         <w:drawing>
           <wp:inline distT="0" distB="0" distL="0" distR="0" wp14:anchorId="7F2ECC41" wp14:editId="3070F784">
@@ -158,7 +164,39 @@
       </w:r>
     </w:p>
     <w:p/>
-    <w:p/>
+    <w:p>
+      <w:pPr>
+        <w:rPr>
+          <w:b/>
+          <w:bCs/>
+        </w:rPr>
+      </w:pPr>
+    </w:p>
+    <w:p>
+      <w:pPr>
+        <w:rPr>
+          <w:b/>
+          <w:bCs/>
+        </w:rPr>
+      </w:pPr>
+      <w:r>
+        <w:rPr>
+          <w:b/>
+          <w:bCs/>
+        </w:rPr>
+        <w:t>GitHub Repository</w:t>
+      </w:r>
+    </w:p>
+    <w:p>
+      <w:hyperlink r:id="rId6" w:history="1">
+        <w:r>
+          <w:rPr>
+            <w:rStyle w:val="Hyperlink"/>
+          </w:rPr>
+          <w:t>Module 7 GitHub Repository</w:t>
+        </w:r>
+      </w:hyperlink>
+    </w:p>
     <w:sectPr>
       <w:pgSz w:w="12240" w:h="15840"/>
       <w:pgMar w:top="1440" w:right="1440" w:bottom="1440" w:left="1440" w:header="720" w:footer="720" w:gutter="0"/>
@@ -772,7 +810,6 @@
   <w:style w:type="character" w:default="1" w:styleId="DefaultParagraphFont">
     <w:name w:val="Default Paragraph Font"/>
     <w:uiPriority w:val="1"/>
-    <w:semiHidden/>
     <w:unhideWhenUsed/>
   </w:style>
   <w:style w:type="table" w:default="1" w:styleId="TableNormal">
@@ -1084,6 +1121,29 @@
       <w:smallCaps/>
       <w:color w:val="0F4761" w:themeColor="accent1" w:themeShade="BF"/>
       <w:spacing w:val="5"/>
+    </w:rPr>
+  </w:style>
+  <w:style w:type="character" w:styleId="Hyperlink">
+    <w:name w:val="Hyperlink"/>
+    <w:basedOn w:val="DefaultParagraphFont"/>
+    <w:uiPriority w:val="99"/>
+    <w:unhideWhenUsed/>
+    <w:rsid w:val="001047C3"/>
+    <w:rPr>
+      <w:color w:val="467886" w:themeColor="hyperlink"/>
+      <w:u w:val="single"/>
+    </w:rPr>
+  </w:style>
+  <w:style w:type="character" w:styleId="UnresolvedMention">
+    <w:name w:val="Unresolved Mention"/>
+    <w:basedOn w:val="DefaultParagraphFont"/>
+    <w:uiPriority w:val="99"/>
+    <w:semiHidden/>
+    <w:unhideWhenUsed/>
+    <w:rsid w:val="001047C3"/>
+    <w:rPr>
+      <w:color w:val="605E5C"/>
+      <w:shd w:val="clear" w:color="auto" w:fill="E1DFDD"/>
     </w:rPr>
   </w:style>
 </w:styles>

</xml_diff>